<commit_message>
editted evidence category and tool
</commit_message>
<xml_diff>
--- a/assets/dialogue/Twins剧情年表建议.docx
+++ b/assets/dialogue/Twins剧情年表建议.docx
@@ -167,7 +167,32 @@
         <w:rPr>
           <w:lang w:eastAsia="zh-CN"/>
         </w:rPr>
-        <w:t>技术发展与家庭悲剧</w:t>
+        <w:t>日月之民与两城分离</w:t>
+      </w:r>
+    </w:p>
+    <w:p>
+      <w:pPr>
+        <w:rPr>
+          <w:lang w:eastAsia="zh-CN"/>
+        </w:rPr>
+      </w:pPr>
+      <w:r>
+        <w:rPr>
+          <w:lang w:eastAsia="zh-CN"/>
+        </w:rPr>
+        <w:t>以下事件均早于</w:t>
+      </w:r>
+      <w:r>
+        <w:rPr>
+          <w:lang w:eastAsia="zh-CN"/>
+        </w:rPr>
+        <w:t>1977</w:t>
+      </w:r>
+      <w:r>
+        <w:rPr>
+          <w:lang w:eastAsia="zh-CN"/>
+        </w:rPr>
+        <w:t>年夜民重新打通地面道路。先后顺序按新增设定补入，具体年代尚未确定，不强行指定公元年份。</w:t>
       </w:r>
     </w:p>
     <w:tbl>
@@ -217,7 +242,7 @@
                 <w:b/>
                 <w:color w:val="FFFFFF"/>
               </w:rPr>
-              <w:t>建议年份</w:t>
+              <w:t>时期</w:t>
             </w:r>
             <w:proofErr w:type="spellEnd"/>
           </w:p>
@@ -250,7 +275,7 @@
                 <w:b/>
                 <w:color w:val="FFFFFF"/>
               </w:rPr>
-              <w:t>距杀婴事件</w:t>
+              <w:t>时间位置</w:t>
             </w:r>
           </w:p>
         </w:tc>
@@ -281,141 +306,7 @@
                 <w:b/>
                 <w:color w:val="FFFFFF"/>
               </w:rPr>
-              <w:t>事件</w:t>
-            </w:r>
-          </w:p>
-        </w:tc>
-      </w:tr>
-      <w:tr>
-        <w:trPr>
-          <w:cantSplit/>
-          <w:jc w:val="center"/>
-        </w:trPr>
-        <w:tc>
-          <w:tcPr>
-            <w:tcW w:w="1531" w:type="dxa"/>
-            <w:tcBorders>
-              <w:top w:val="single" w:sz="4" w:space="0" w:color="D9D9D9"/>
-              <w:left w:val="single" w:sz="4" w:space="0" w:color="D9D9D9"/>
-              <w:bottom w:val="single" w:sz="4" w:space="0" w:color="D9D9D9"/>
-              <w:right w:val="single" w:sz="4" w:space="0" w:color="D9D9D9"/>
-            </w:tcBorders>
-            <w:shd w:val="clear" w:color="auto" w:fill="FFFFFF"/>
-            <w:tcMar>
-              <w:top w:w="90" w:type="dxa"/>
-              <w:left w:w="105" w:type="dxa"/>
-              <w:bottom w:w="90" w:type="dxa"/>
-              <w:right w:w="105" w:type="dxa"/>
-            </w:tcMar>
-            <w:vAlign w:val="center"/>
-          </w:tcPr>
-          <w:p>
-            <w:pPr>
-              <w:spacing w:after="0" w:line="269" w:lineRule="auto"/>
-              <w:jc w:val="center"/>
-              <w:rPr>
-                <w:rFonts w:hint="eastAsia"/>
-                <w:lang w:eastAsia="zh-CN"/>
-              </w:rPr>
-            </w:pPr>
-            <w:r>
-              <w:rPr>
-                <w:rFonts w:hint="eastAsia"/>
-                <w:lang w:eastAsia="zh-CN"/>
-              </w:rPr>
-              <w:t>1950</w:t>
-            </w:r>
-            <w:r>
-              <w:rPr>
-                <w:rFonts w:hint="eastAsia"/>
-                <w:lang w:eastAsia="zh-CN"/>
-              </w:rPr>
-              <w:t>年</w:t>
-            </w:r>
-          </w:p>
-        </w:tc>
-        <w:tc>
-          <w:tcPr>
-            <w:tcW w:w="1474" w:type="dxa"/>
-            <w:tcBorders>
-              <w:top w:val="single" w:sz="4" w:space="0" w:color="D9D9D9"/>
-              <w:left w:val="single" w:sz="4" w:space="0" w:color="D9D9D9"/>
-              <w:bottom w:val="single" w:sz="4" w:space="0" w:color="D9D9D9"/>
-              <w:right w:val="single" w:sz="4" w:space="0" w:color="D9D9D9"/>
-            </w:tcBorders>
-            <w:shd w:val="clear" w:color="auto" w:fill="FFFFFF"/>
-            <w:tcMar>
-              <w:top w:w="90" w:type="dxa"/>
-              <w:left w:w="105" w:type="dxa"/>
-              <w:bottom w:w="90" w:type="dxa"/>
-              <w:right w:w="105" w:type="dxa"/>
-            </w:tcMar>
-            <w:vAlign w:val="center"/>
-          </w:tcPr>
-          <w:p>
-            <w:pPr>
-              <w:spacing w:after="0" w:line="269" w:lineRule="auto"/>
-              <w:jc w:val="center"/>
-              <w:rPr>
-                <w:rFonts w:hint="eastAsia"/>
-                <w:lang w:eastAsia="zh-CN"/>
-              </w:rPr>
-            </w:pPr>
-            <w:r>
-              <w:rPr>
-                <w:rFonts w:hint="eastAsia"/>
-                <w:lang w:eastAsia="zh-CN"/>
-              </w:rPr>
-              <w:t>前</w:t>
-            </w:r>
-            <w:r>
-              <w:rPr>
-                <w:rFonts w:hint="eastAsia"/>
-                <w:lang w:eastAsia="zh-CN"/>
-              </w:rPr>
-              <w:t>50</w:t>
-            </w:r>
-            <w:r>
-              <w:rPr>
-                <w:rFonts w:hint="eastAsia"/>
-                <w:lang w:eastAsia="zh-CN"/>
-              </w:rPr>
-              <w:t>年</w:t>
-            </w:r>
-          </w:p>
-        </w:tc>
-        <w:tc>
-          <w:tcPr>
-            <w:tcW w:w="6860" w:type="dxa"/>
-            <w:tcBorders>
-              <w:top w:val="single" w:sz="4" w:space="0" w:color="D9D9D9"/>
-              <w:left w:val="single" w:sz="4" w:space="0" w:color="D9D9D9"/>
-              <w:bottom w:val="single" w:sz="4" w:space="0" w:color="D9D9D9"/>
-              <w:right w:val="single" w:sz="4" w:space="0" w:color="D9D9D9"/>
-            </w:tcBorders>
-            <w:shd w:val="clear" w:color="auto" w:fill="FFFFFF"/>
-            <w:tcMar>
-              <w:top w:w="90" w:type="dxa"/>
-              <w:left w:w="105" w:type="dxa"/>
-              <w:bottom w:w="90" w:type="dxa"/>
-              <w:right w:w="105" w:type="dxa"/>
-            </w:tcMar>
-            <w:vAlign w:val="center"/>
-          </w:tcPr>
-          <w:p>
-            <w:pPr>
-              <w:spacing w:after="0" w:line="269" w:lineRule="auto"/>
-              <w:rPr>
-                <w:rFonts w:hint="eastAsia"/>
-                <w:lang w:eastAsia="zh-CN"/>
-              </w:rPr>
-            </w:pPr>
-            <w:r>
-              <w:rPr>
-                <w:rFonts w:hint="eastAsia"/>
-                <w:lang w:eastAsia="zh-CN"/>
-              </w:rPr>
-              <w:t>曾统称为日月之民的混住社群经历了昼城发起的隔离。昼城在发展过程中逐渐有了语言、身份这样的建构，而夜民只是保持动物性的生存状态，让昼民认为与夜民共享睡棺肮脏会引发疾病。他们将夜民的睡棺移至地下，随后制造一场人为的塌方封锁向上道路，为保全昼民对地面世界的绝对使用权，彻底与夜民划清界限（史书上却写作因人口激增的无奈之举）。这一批夜民在暗不见天日的地下视觉退化，也失去了对地面的记忆，只是在向四面八方寻找水源和食物。部分昼城仍有的夜城符号（比如月亮）也源于混住时期的信息共享。</w:t>
+              <w:t>事件与记载</w:t>
             </w:r>
           </w:p>
         </w:tc>
@@ -449,10 +340,7 @@
               <w:jc w:val="center"/>
             </w:pPr>
             <w:r>
-              <w:t>1977</w:t>
-            </w:r>
-            <w:r>
-              <w:t>年</w:t>
+              <w:t>日月之民时期</w:t>
             </w:r>
           </w:p>
         </w:tc>
@@ -480,13 +368,7 @@
               <w:jc w:val="center"/>
             </w:pPr>
             <w:r>
-              <w:t>前</w:t>
-            </w:r>
-            <w:r>
-              <w:t>23</w:t>
-            </w:r>
-            <w:r>
-              <w:t>年</w:t>
+              <w:t>分离之前</w:t>
             </w:r>
           </w:p>
         </w:tc>
@@ -519,7 +401,104 @@
               <w:rPr>
                 <w:lang w:eastAsia="zh-CN"/>
               </w:rPr>
-              <w:t>夜民重新打通通往地面的道路，获取地面食物。昼民称其为</w:t>
+              <w:t>昼民与夜民曾共同生活，被称为日月之民。双方共用睡棺，交替活动而互不影响；昼夜身份尚未被固化为彼此排斥的族群。</w:t>
+            </w:r>
+          </w:p>
+        </w:tc>
+      </w:tr>
+      <w:tr>
+        <w:trPr>
+          <w:cantSplit/>
+          <w:jc w:val="center"/>
+        </w:trPr>
+        <w:tc>
+          <w:tcPr>
+            <w:tcW w:w="1531" w:type="dxa"/>
+            <w:tcBorders>
+              <w:top w:val="single" w:sz="4" w:space="0" w:color="D9D9D9"/>
+              <w:left w:val="single" w:sz="4" w:space="0" w:color="D9D9D9"/>
+              <w:bottom w:val="single" w:sz="4" w:space="0" w:color="D9D9D9"/>
+              <w:right w:val="single" w:sz="4" w:space="0" w:color="D9D9D9"/>
+            </w:tcBorders>
+            <w:shd w:val="clear" w:color="auto" w:fill="FFFFFF"/>
+            <w:tcMar>
+              <w:top w:w="90" w:type="dxa"/>
+              <w:left w:w="105" w:type="dxa"/>
+              <w:bottom w:w="90" w:type="dxa"/>
+              <w:right w:w="105" w:type="dxa"/>
+            </w:tcMar>
+            <w:vAlign w:val="center"/>
+          </w:tcPr>
+          <w:p>
+            <w:pPr>
+              <w:spacing w:after="0" w:line="269" w:lineRule="auto"/>
+              <w:jc w:val="center"/>
+            </w:pPr>
+            <w:proofErr w:type="spellStart"/>
+            <w:r>
+              <w:t>驱逐时期</w:t>
+            </w:r>
+            <w:proofErr w:type="spellEnd"/>
+          </w:p>
+        </w:tc>
+        <w:tc>
+          <w:tcPr>
+            <w:tcW w:w="1474" w:type="dxa"/>
+            <w:tcBorders>
+              <w:top w:val="single" w:sz="4" w:space="0" w:color="D9D9D9"/>
+              <w:left w:val="single" w:sz="4" w:space="0" w:color="D9D9D9"/>
+              <w:bottom w:val="single" w:sz="4" w:space="0" w:color="D9D9D9"/>
+              <w:right w:val="single" w:sz="4" w:space="0" w:color="D9D9D9"/>
+            </w:tcBorders>
+            <w:shd w:val="clear" w:color="auto" w:fill="FFFFFF"/>
+            <w:tcMar>
+              <w:top w:w="90" w:type="dxa"/>
+              <w:left w:w="105" w:type="dxa"/>
+              <w:bottom w:w="90" w:type="dxa"/>
+              <w:right w:w="105" w:type="dxa"/>
+            </w:tcMar>
+            <w:vAlign w:val="center"/>
+          </w:tcPr>
+          <w:p>
+            <w:pPr>
+              <w:spacing w:after="0" w:line="269" w:lineRule="auto"/>
+              <w:jc w:val="center"/>
+            </w:pPr>
+            <w:r>
+              <w:t>共居之后</w:t>
+            </w:r>
+          </w:p>
+        </w:tc>
+        <w:tc>
+          <w:tcPr>
+            <w:tcW w:w="6860" w:type="dxa"/>
+            <w:tcBorders>
+              <w:top w:val="single" w:sz="4" w:space="0" w:color="D9D9D9"/>
+              <w:left w:val="single" w:sz="4" w:space="0" w:color="D9D9D9"/>
+              <w:bottom w:val="single" w:sz="4" w:space="0" w:color="D9D9D9"/>
+              <w:right w:val="single" w:sz="4" w:space="0" w:color="D9D9D9"/>
+            </w:tcBorders>
+            <w:shd w:val="clear" w:color="auto" w:fill="FFFFFF"/>
+            <w:tcMar>
+              <w:top w:w="90" w:type="dxa"/>
+              <w:left w:w="105" w:type="dxa"/>
+              <w:bottom w:w="90" w:type="dxa"/>
+              <w:right w:w="105" w:type="dxa"/>
+            </w:tcMar>
+            <w:vAlign w:val="center"/>
+          </w:tcPr>
+          <w:p>
+            <w:pPr>
+              <w:spacing w:after="0" w:line="269" w:lineRule="auto"/>
+              <w:rPr>
+                <w:lang w:eastAsia="zh-CN"/>
+              </w:rPr>
+            </w:pPr>
+            <w:r>
+              <w:rPr>
+                <w:lang w:eastAsia="zh-CN"/>
+              </w:rPr>
+              <w:t>昼城史书以</w:t>
             </w:r>
             <w:r>
               <w:rPr>
@@ -527,7 +506,240 @@
               </w:rPr>
               <w:t>“</w:t>
             </w:r>
-            <w:proofErr w:type="gramStart"/>
+            <w:r>
+              <w:rPr>
+                <w:lang w:eastAsia="zh-CN"/>
+              </w:rPr>
+              <w:t>人口激增</w:t>
+            </w:r>
+            <w:r>
+              <w:rPr>
+                <w:lang w:eastAsia="zh-CN"/>
+              </w:rPr>
+              <w:t>”</w:t>
+            </w:r>
+            <w:r>
+              <w:rPr>
+                <w:lang w:eastAsia="zh-CN"/>
+              </w:rPr>
+              <w:t>为由，记载夜民被驱赶至地下。设定真相：驱逐确实发生，但人口理由是掩饰，背后的动机更接近领地意识与排他。</w:t>
+            </w:r>
+          </w:p>
+        </w:tc>
+      </w:tr>
+      <w:tr>
+        <w:trPr>
+          <w:cantSplit/>
+          <w:jc w:val="center"/>
+        </w:trPr>
+        <w:tc>
+          <w:tcPr>
+            <w:tcW w:w="1531" w:type="dxa"/>
+            <w:tcBorders>
+              <w:top w:val="single" w:sz="4" w:space="0" w:color="D9D9D9"/>
+              <w:left w:val="single" w:sz="4" w:space="0" w:color="D9D9D9"/>
+              <w:bottom w:val="single" w:sz="4" w:space="0" w:color="D9D9D9"/>
+              <w:right w:val="single" w:sz="4" w:space="0" w:color="D9D9D9"/>
+            </w:tcBorders>
+            <w:shd w:val="clear" w:color="auto" w:fill="FFFFFF"/>
+            <w:tcMar>
+              <w:top w:w="90" w:type="dxa"/>
+              <w:left w:w="105" w:type="dxa"/>
+              <w:bottom w:w="90" w:type="dxa"/>
+              <w:right w:w="105" w:type="dxa"/>
+            </w:tcMar>
+            <w:vAlign w:val="center"/>
+          </w:tcPr>
+          <w:p>
+            <w:pPr>
+              <w:spacing w:after="0" w:line="269" w:lineRule="auto"/>
+              <w:jc w:val="center"/>
+            </w:pPr>
+            <w:proofErr w:type="spellStart"/>
+            <w:r>
+              <w:t>塌方事件</w:t>
+            </w:r>
+            <w:proofErr w:type="spellEnd"/>
+          </w:p>
+        </w:tc>
+        <w:tc>
+          <w:tcPr>
+            <w:tcW w:w="1474" w:type="dxa"/>
+            <w:tcBorders>
+              <w:top w:val="single" w:sz="4" w:space="0" w:color="D9D9D9"/>
+              <w:left w:val="single" w:sz="4" w:space="0" w:color="D9D9D9"/>
+              <w:bottom w:val="single" w:sz="4" w:space="0" w:color="D9D9D9"/>
+              <w:right w:val="single" w:sz="4" w:space="0" w:color="D9D9D9"/>
+            </w:tcBorders>
+            <w:shd w:val="clear" w:color="auto" w:fill="FFFFFF"/>
+            <w:tcMar>
+              <w:top w:w="90" w:type="dxa"/>
+              <w:left w:w="105" w:type="dxa"/>
+              <w:bottom w:w="90" w:type="dxa"/>
+              <w:right w:w="105" w:type="dxa"/>
+            </w:tcMar>
+            <w:vAlign w:val="center"/>
+          </w:tcPr>
+          <w:p>
+            <w:pPr>
+              <w:spacing w:after="0" w:line="269" w:lineRule="auto"/>
+              <w:jc w:val="center"/>
+            </w:pPr>
+            <w:r>
+              <w:t>驱逐之后</w:t>
+            </w:r>
+          </w:p>
+        </w:tc>
+        <w:tc>
+          <w:tcPr>
+            <w:tcW w:w="6860" w:type="dxa"/>
+            <w:tcBorders>
+              <w:top w:val="single" w:sz="4" w:space="0" w:color="D9D9D9"/>
+              <w:left w:val="single" w:sz="4" w:space="0" w:color="D9D9D9"/>
+              <w:bottom w:val="single" w:sz="4" w:space="0" w:color="D9D9D9"/>
+              <w:right w:val="single" w:sz="4" w:space="0" w:color="D9D9D9"/>
+            </w:tcBorders>
+            <w:shd w:val="clear" w:color="auto" w:fill="FFFFFF"/>
+            <w:tcMar>
+              <w:top w:w="90" w:type="dxa"/>
+              <w:left w:w="105" w:type="dxa"/>
+              <w:bottom w:w="90" w:type="dxa"/>
+              <w:right w:w="105" w:type="dxa"/>
+            </w:tcMar>
+            <w:vAlign w:val="center"/>
+          </w:tcPr>
+          <w:p>
+            <w:pPr>
+              <w:spacing w:after="0" w:line="269" w:lineRule="auto"/>
+              <w:rPr>
+                <w:lang w:eastAsia="zh-CN"/>
+              </w:rPr>
+            </w:pPr>
+            <w:r>
+              <w:rPr>
+                <w:lang w:eastAsia="zh-CN"/>
+              </w:rPr>
+              <w:t>昼城人为制造塌方，阻断两地联系，并伪装成自然灾害。史书保留这场灾害的记载，却掩盖其人为原因。</w:t>
+            </w:r>
+          </w:p>
+        </w:tc>
+      </w:tr>
+      <w:tr>
+        <w:trPr>
+          <w:cantSplit/>
+          <w:jc w:val="center"/>
+        </w:trPr>
+        <w:tc>
+          <w:tcPr>
+            <w:tcW w:w="1531" w:type="dxa"/>
+            <w:tcBorders>
+              <w:top w:val="single" w:sz="4" w:space="0" w:color="D9D9D9"/>
+              <w:left w:val="single" w:sz="4" w:space="0" w:color="D9D9D9"/>
+              <w:bottom w:val="single" w:sz="4" w:space="0" w:color="D9D9D9"/>
+              <w:right w:val="single" w:sz="4" w:space="0" w:color="D9D9D9"/>
+            </w:tcBorders>
+            <w:shd w:val="clear" w:color="auto" w:fill="FFFFFF"/>
+            <w:tcMar>
+              <w:top w:w="90" w:type="dxa"/>
+              <w:left w:w="105" w:type="dxa"/>
+              <w:bottom w:w="90" w:type="dxa"/>
+              <w:right w:w="105" w:type="dxa"/>
+            </w:tcMar>
+            <w:vAlign w:val="center"/>
+          </w:tcPr>
+          <w:p>
+            <w:pPr>
+              <w:spacing w:after="0" w:line="269" w:lineRule="auto"/>
+              <w:jc w:val="center"/>
+            </w:pPr>
+            <w:r>
+              <w:t>地下隔离时期</w:t>
+            </w:r>
+          </w:p>
+        </w:tc>
+        <w:tc>
+          <w:tcPr>
+            <w:tcW w:w="1474" w:type="dxa"/>
+            <w:tcBorders>
+              <w:top w:val="single" w:sz="4" w:space="0" w:color="D9D9D9"/>
+              <w:left w:val="single" w:sz="4" w:space="0" w:color="D9D9D9"/>
+              <w:bottom w:val="single" w:sz="4" w:space="0" w:color="D9D9D9"/>
+              <w:right w:val="single" w:sz="4" w:space="0" w:color="D9D9D9"/>
+            </w:tcBorders>
+            <w:shd w:val="clear" w:color="auto" w:fill="FFFFFF"/>
+            <w:tcMar>
+              <w:top w:w="90" w:type="dxa"/>
+              <w:left w:w="105" w:type="dxa"/>
+              <w:bottom w:w="90" w:type="dxa"/>
+              <w:right w:w="105" w:type="dxa"/>
+            </w:tcMar>
+            <w:vAlign w:val="center"/>
+          </w:tcPr>
+          <w:p>
+            <w:pPr>
+              <w:spacing w:after="0" w:line="269" w:lineRule="auto"/>
+              <w:jc w:val="center"/>
+            </w:pPr>
+            <w:r>
+              <w:t>塌方后至</w:t>
+            </w:r>
+            <w:r>
+              <w:t>1977</w:t>
+            </w:r>
+            <w:r>
+              <w:t>年前</w:t>
+            </w:r>
+          </w:p>
+        </w:tc>
+        <w:tc>
+          <w:tcPr>
+            <w:tcW w:w="6860" w:type="dxa"/>
+            <w:tcBorders>
+              <w:top w:val="single" w:sz="4" w:space="0" w:color="D9D9D9"/>
+              <w:left w:val="single" w:sz="4" w:space="0" w:color="D9D9D9"/>
+              <w:bottom w:val="single" w:sz="4" w:space="0" w:color="D9D9D9"/>
+              <w:right w:val="single" w:sz="4" w:space="0" w:color="D9D9D9"/>
+            </w:tcBorders>
+            <w:shd w:val="clear" w:color="auto" w:fill="FFFFFF"/>
+            <w:tcMar>
+              <w:top w:w="90" w:type="dxa"/>
+              <w:left w:w="105" w:type="dxa"/>
+              <w:bottom w:w="90" w:type="dxa"/>
+              <w:right w:w="105" w:type="dxa"/>
+            </w:tcMar>
+            <w:vAlign w:val="center"/>
+          </w:tcPr>
+          <w:p>
+            <w:pPr>
+              <w:spacing w:after="0" w:line="269" w:lineRule="auto"/>
+              <w:rPr>
+                <w:lang w:eastAsia="zh-CN"/>
+              </w:rPr>
+            </w:pPr>
+            <w:r>
+              <w:rPr>
+                <w:lang w:eastAsia="zh-CN"/>
+              </w:rPr>
+              <w:t>夜民在地下生活，两城长期分隔。</w:t>
+            </w:r>
+            <w:r>
+              <w:rPr>
+                <w:lang w:eastAsia="zh-CN"/>
+              </w:rPr>
+              <w:t>1977</w:t>
+            </w:r>
+            <w:r>
+              <w:rPr>
+                <w:lang w:eastAsia="zh-CN"/>
+              </w:rPr>
+              <w:t>年重新打通道路，是恢复曾经存在的联系；昼城随后以</w:t>
+            </w:r>
+            <w:r>
+              <w:rPr>
+                <w:lang w:eastAsia="zh-CN"/>
+              </w:rPr>
+              <w:t>“</w:t>
+            </w:r>
             <w:r>
               <w:rPr>
                 <w:lang w:eastAsia="zh-CN"/>
@@ -544,14 +756,329 @@
               <w:rPr>
                 <w:lang w:eastAsia="zh-CN"/>
               </w:rPr>
-              <w:t>。</w:t>
-            </w:r>
-            <w:proofErr w:type="gramEnd"/>
+              <w:t>描述夜民归来。</w:t>
+            </w:r>
+          </w:p>
+        </w:tc>
+      </w:tr>
+    </w:tbl>
+    <w:p>
+      <w:pPr>
+        <w:rPr>
+          <w:lang w:eastAsia="zh-CN"/>
+        </w:rPr>
+      </w:pPr>
+      <w:r>
+        <w:rPr>
+          <w:lang w:eastAsia="zh-CN"/>
+        </w:rPr>
+        <w:t>推理依据：共用睡棺且互不影响，使</w:t>
+      </w:r>
+      <w:r>
+        <w:rPr>
+          <w:lang w:eastAsia="zh-CN"/>
+        </w:rPr>
+        <w:t>“</w:t>
+      </w:r>
+      <w:r>
+        <w:rPr>
+          <w:lang w:eastAsia="zh-CN"/>
+        </w:rPr>
+        <w:t>必须为另一族腾出居住位置</w:t>
+      </w:r>
+      <w:r>
+        <w:rPr>
+          <w:lang w:eastAsia="zh-CN"/>
+        </w:rPr>
+        <w:t>”</w:t>
+      </w:r>
+      <w:r>
+        <w:rPr>
+          <w:lang w:eastAsia="zh-CN"/>
+        </w:rPr>
+        <w:t>的解释站不住脚，指向领地意识。它本身不足以证明所有资源压力均不存在；人为塌方的真相仍需另有线索印证。</w:t>
+      </w:r>
+    </w:p>
+    <w:p>
+      <w:pPr>
+        <w:rPr>
+          <w:lang w:eastAsia="zh-CN"/>
+        </w:rPr>
+      </w:pPr>
+      <w:r>
+        <w:rPr>
+          <w:lang w:eastAsia="zh-CN"/>
+        </w:rPr>
+        <w:t>史书呈现：可直接记下共居、人口激增、迁往地下与塌方这些事件；人口理由和自然灾害归因属于官方叙述，不等同于事实。玩家需要读出这层区别。</w:t>
+      </w:r>
+    </w:p>
+    <w:p>
+      <w:pPr>
+        <w:rPr>
+          <w:lang w:eastAsia="zh-CN"/>
+        </w:rPr>
+      </w:pPr>
+      <w:r>
+        <w:rPr>
+          <w:lang w:eastAsia="zh-CN"/>
+        </w:rPr>
+        <w:br w:type="page"/>
+      </w:r>
+    </w:p>
+    <w:p>
+      <w:pPr>
+        <w:pStyle w:val="Heading1"/>
+      </w:pPr>
+      <w:proofErr w:type="spellStart"/>
+      <w:r>
+        <w:lastRenderedPageBreak/>
+        <w:t>技术发展与家庭悲剧</w:t>
+      </w:r>
+      <w:proofErr w:type="spellEnd"/>
+    </w:p>
+    <w:tbl>
+      <w:tblPr>
+        <w:tblW w:w="0" w:type="auto"/>
+        <w:jc w:val="center"/>
+        <w:tblLayout w:type="fixed"/>
+        <w:tblLook w:val="04A0" w:firstRow="1" w:lastRow="0" w:firstColumn="1" w:lastColumn="0" w:noHBand="0" w:noVBand="1"/>
+      </w:tblPr>
+      <w:tblGrid>
+        <w:gridCol w:w="1531"/>
+        <w:gridCol w:w="1474"/>
+        <w:gridCol w:w="6860"/>
+      </w:tblGrid>
+      <w:tr>
+        <w:trPr>
+          <w:cantSplit/>
+          <w:tblHeader/>
+          <w:jc w:val="center"/>
+        </w:trPr>
+        <w:tc>
+          <w:tcPr>
+            <w:tcW w:w="1531" w:type="dxa"/>
+            <w:tcBorders>
+              <w:top w:val="single" w:sz="4" w:space="0" w:color="D9D9D9"/>
+              <w:left w:val="single" w:sz="4" w:space="0" w:color="D9D9D9"/>
+              <w:bottom w:val="single" w:sz="4" w:space="0" w:color="D9D9D9"/>
+              <w:right w:val="single" w:sz="4" w:space="0" w:color="D9D9D9"/>
+            </w:tcBorders>
+            <w:shd w:val="clear" w:color="auto" w:fill="404C47"/>
+            <w:tcMar>
+              <w:top w:w="90" w:type="dxa"/>
+              <w:left w:w="105" w:type="dxa"/>
+              <w:bottom w:w="90" w:type="dxa"/>
+              <w:right w:w="105" w:type="dxa"/>
+            </w:tcMar>
+            <w:vAlign w:val="center"/>
+          </w:tcPr>
+          <w:p>
+            <w:pPr>
+              <w:spacing w:after="0" w:line="269" w:lineRule="auto"/>
+              <w:jc w:val="center"/>
+            </w:pPr>
+            <w:r>
+              <w:rPr>
+                <w:b/>
+                <w:color w:val="FFFFFF"/>
+              </w:rPr>
+              <w:t>建议年份</w:t>
+            </w:r>
+          </w:p>
+        </w:tc>
+        <w:tc>
+          <w:tcPr>
+            <w:tcW w:w="1474" w:type="dxa"/>
+            <w:tcBorders>
+              <w:top w:val="single" w:sz="4" w:space="0" w:color="D9D9D9"/>
+              <w:left w:val="single" w:sz="4" w:space="0" w:color="D9D9D9"/>
+              <w:bottom w:val="single" w:sz="4" w:space="0" w:color="D9D9D9"/>
+              <w:right w:val="single" w:sz="4" w:space="0" w:color="D9D9D9"/>
+            </w:tcBorders>
+            <w:shd w:val="clear" w:color="auto" w:fill="404C47"/>
+            <w:tcMar>
+              <w:top w:w="90" w:type="dxa"/>
+              <w:left w:w="105" w:type="dxa"/>
+              <w:bottom w:w="90" w:type="dxa"/>
+              <w:right w:w="105" w:type="dxa"/>
+            </w:tcMar>
+            <w:vAlign w:val="center"/>
+          </w:tcPr>
+          <w:p>
+            <w:pPr>
+              <w:spacing w:after="0" w:line="269" w:lineRule="auto"/>
+              <w:jc w:val="center"/>
+            </w:pPr>
+            <w:r>
+              <w:rPr>
+                <w:b/>
+                <w:color w:val="FFFFFF"/>
+              </w:rPr>
+              <w:t>距杀婴事件</w:t>
+            </w:r>
+          </w:p>
+        </w:tc>
+        <w:tc>
+          <w:tcPr>
+            <w:tcW w:w="6860" w:type="dxa"/>
+            <w:tcBorders>
+              <w:top w:val="single" w:sz="4" w:space="0" w:color="D9D9D9"/>
+              <w:left w:val="single" w:sz="4" w:space="0" w:color="D9D9D9"/>
+              <w:bottom w:val="single" w:sz="4" w:space="0" w:color="D9D9D9"/>
+              <w:right w:val="single" w:sz="4" w:space="0" w:color="D9D9D9"/>
+            </w:tcBorders>
+            <w:shd w:val="clear" w:color="auto" w:fill="404C47"/>
+            <w:tcMar>
+              <w:top w:w="90" w:type="dxa"/>
+              <w:left w:w="105" w:type="dxa"/>
+              <w:bottom w:w="90" w:type="dxa"/>
+              <w:right w:w="105" w:type="dxa"/>
+            </w:tcMar>
+            <w:vAlign w:val="center"/>
+          </w:tcPr>
+          <w:p>
+            <w:pPr>
+              <w:spacing w:after="0" w:line="269" w:lineRule="auto"/>
+            </w:pPr>
+            <w:r>
+              <w:rPr>
+                <w:b/>
+                <w:color w:val="FFFFFF"/>
+              </w:rPr>
+              <w:t>事件</w:t>
+            </w:r>
+          </w:p>
+        </w:tc>
+      </w:tr>
+      <w:tr>
+        <w:trPr>
+          <w:cantSplit/>
+          <w:jc w:val="center"/>
+        </w:trPr>
+        <w:tc>
+          <w:tcPr>
+            <w:tcW w:w="1531" w:type="dxa"/>
+            <w:tcBorders>
+              <w:top w:val="single" w:sz="4" w:space="0" w:color="D9D9D9"/>
+              <w:left w:val="single" w:sz="4" w:space="0" w:color="D9D9D9"/>
+              <w:bottom w:val="single" w:sz="4" w:space="0" w:color="D9D9D9"/>
+              <w:right w:val="single" w:sz="4" w:space="0" w:color="D9D9D9"/>
+            </w:tcBorders>
+            <w:shd w:val="clear" w:color="auto" w:fill="FFFFFF"/>
+            <w:tcMar>
+              <w:top w:w="90" w:type="dxa"/>
+              <w:left w:w="105" w:type="dxa"/>
+              <w:bottom w:w="90" w:type="dxa"/>
+              <w:right w:w="105" w:type="dxa"/>
+            </w:tcMar>
+            <w:vAlign w:val="center"/>
+          </w:tcPr>
+          <w:p>
+            <w:pPr>
+              <w:spacing w:after="0" w:line="269" w:lineRule="auto"/>
+              <w:jc w:val="center"/>
+            </w:pPr>
+            <w:r>
+              <w:t>1977</w:t>
+            </w:r>
+            <w:r>
+              <w:t>年</w:t>
+            </w:r>
+          </w:p>
+        </w:tc>
+        <w:tc>
+          <w:tcPr>
+            <w:tcW w:w="1474" w:type="dxa"/>
+            <w:tcBorders>
+              <w:top w:val="single" w:sz="4" w:space="0" w:color="D9D9D9"/>
+              <w:left w:val="single" w:sz="4" w:space="0" w:color="D9D9D9"/>
+              <w:bottom w:val="single" w:sz="4" w:space="0" w:color="D9D9D9"/>
+              <w:right w:val="single" w:sz="4" w:space="0" w:color="D9D9D9"/>
+            </w:tcBorders>
+            <w:shd w:val="clear" w:color="auto" w:fill="FFFFFF"/>
+            <w:tcMar>
+              <w:top w:w="90" w:type="dxa"/>
+              <w:left w:w="105" w:type="dxa"/>
+              <w:bottom w:w="90" w:type="dxa"/>
+              <w:right w:w="105" w:type="dxa"/>
+            </w:tcMar>
+            <w:vAlign w:val="center"/>
+          </w:tcPr>
+          <w:p>
+            <w:pPr>
+              <w:spacing w:after="0" w:line="269" w:lineRule="auto"/>
+              <w:jc w:val="center"/>
+            </w:pPr>
+            <w:r>
+              <w:t>前</w:t>
+            </w:r>
+            <w:r>
+              <w:t>23</w:t>
+            </w:r>
+            <w:r>
+              <w:t>年</w:t>
+            </w:r>
+          </w:p>
+        </w:tc>
+        <w:tc>
+          <w:tcPr>
+            <w:tcW w:w="6860" w:type="dxa"/>
+            <w:tcBorders>
+              <w:top w:val="single" w:sz="4" w:space="0" w:color="D9D9D9"/>
+              <w:left w:val="single" w:sz="4" w:space="0" w:color="D9D9D9"/>
+              <w:bottom w:val="single" w:sz="4" w:space="0" w:color="D9D9D9"/>
+              <w:right w:val="single" w:sz="4" w:space="0" w:color="D9D9D9"/>
+            </w:tcBorders>
+            <w:shd w:val="clear" w:color="auto" w:fill="FFFFFF"/>
+            <w:tcMar>
+              <w:top w:w="90" w:type="dxa"/>
+              <w:left w:w="105" w:type="dxa"/>
+              <w:bottom w:w="90" w:type="dxa"/>
+              <w:right w:w="105" w:type="dxa"/>
+            </w:tcMar>
+            <w:vAlign w:val="center"/>
+          </w:tcPr>
+          <w:p>
+            <w:pPr>
+              <w:spacing w:after="0" w:line="269" w:lineRule="auto"/>
+            </w:pPr>
             <w:r>
               <w:rPr>
                 <w:lang w:eastAsia="zh-CN"/>
               </w:rPr>
-              <w:t>牧羊人和几名守夜者相继消失。</w:t>
+              <w:t>夜民重新打通通往地面的道路，获取地面食物。</w:t>
+            </w:r>
+            <w:r>
+              <w:t>昼民称其为</w:t>
+            </w:r>
+            <w:r>
+              <w:t>“</w:t>
+            </w:r>
+            <w:proofErr w:type="spellStart"/>
+            <w:r>
+              <w:t>魔鬼降临</w:t>
+            </w:r>
+            <w:proofErr w:type="spellEnd"/>
+            <w:r>
+              <w:t>”</w:t>
+            </w:r>
+            <w:r>
+              <w:t>。</w:t>
+            </w:r>
+            <w:proofErr w:type="spellStart"/>
+            <w:r>
+              <w:t>牧羊人和几名守夜者相继</w:t>
+            </w:r>
+            <w:proofErr w:type="spellEnd"/>
+            <w:r>
+              <w:rPr>
+                <w:rFonts w:hint="eastAsia"/>
+                <w:lang w:eastAsia="zh-CN"/>
+              </w:rPr>
+              <w:t>因超过昼夜限制死亡</w:t>
+            </w:r>
+            <w:r>
+              <w:t>。</w:t>
             </w:r>
           </w:p>
         </w:tc>
@@ -667,14 +1194,7 @@
               <w:rPr>
                 <w:lang w:eastAsia="zh-CN"/>
               </w:rPr>
-              <w:t>岁，</w:t>
-            </w:r>
-            <w:proofErr w:type="gramStart"/>
-            <w:r>
-              <w:rPr>
-                <w:lang w:eastAsia="zh-CN"/>
-              </w:rPr>
-              <w:t>符合小说中</w:t>
+              <w:t>岁，符合小说中</w:t>
             </w:r>
             <w:r>
               <w:rPr>
@@ -698,14 +1218,7 @@
               <w:rPr>
                 <w:lang w:eastAsia="zh-CN"/>
               </w:rPr>
-              <w:t>的描写</w:t>
-            </w:r>
-            <w:proofErr w:type="gramEnd"/>
-            <w:r>
-              <w:rPr>
-                <w:lang w:eastAsia="zh-CN"/>
-              </w:rPr>
-              <w:t>。</w:t>
+              <w:t>的描写。</w:t>
             </w:r>
           </w:p>
         </w:tc>
@@ -1314,7 +1827,6 @@
             </w:pPr>
             <w:proofErr w:type="spellStart"/>
             <w:r>
-              <w:lastRenderedPageBreak/>
               <w:t>随后数日或数周</w:t>
             </w:r>
             <w:proofErr w:type="spellEnd"/>
@@ -2098,7 +2610,6 @@
             <w:pPr>
               <w:spacing w:after="0" w:line="269" w:lineRule="auto"/>
               <w:rPr>
-                <w:rFonts w:hint="eastAsia"/>
                 <w:lang w:eastAsia="zh-CN"/>
               </w:rPr>
             </w:pPr>
@@ -2107,13 +2618,6 @@
                 <w:lang w:eastAsia="zh-CN"/>
               </w:rPr>
               <w:t>女儿探索废墟，夜间未归，却依靠旧睡棺活到次日。她带回竖立睡棺与混葬墓群的发现，动摇母亲对两个种族的理解。</w:t>
-            </w:r>
-            <w:r>
-              <w:rPr>
-                <w:rFonts w:hint="eastAsia"/>
-                <w:lang w:eastAsia="zh-CN"/>
-              </w:rPr>
-              <w:t>但母亲依旧坚定斥责女儿夜不归宿，令人担心，立场不坚定，就会为人鱼肉。女儿没有察觉母亲的动摇，只得到彻底令人失望的讯息。</w:t>
             </w:r>
           </w:p>
         </w:tc>
@@ -3858,31 +4362,31 @@
       </w:rPr>
     </w:lvl>
   </w:abstractNum>
-  <w:num w:numId="1" w16cid:durableId="38628554">
+  <w:num w:numId="1" w16cid:durableId="2136676300">
     <w:abstractNumId w:val="8"/>
   </w:num>
-  <w:num w:numId="2" w16cid:durableId="1195997431">
+  <w:num w:numId="2" w16cid:durableId="1936473865">
     <w:abstractNumId w:val="6"/>
   </w:num>
-  <w:num w:numId="3" w16cid:durableId="553199293">
+  <w:num w:numId="3" w16cid:durableId="578636849">
     <w:abstractNumId w:val="5"/>
   </w:num>
-  <w:num w:numId="4" w16cid:durableId="286934885">
+  <w:num w:numId="4" w16cid:durableId="580720069">
     <w:abstractNumId w:val="4"/>
   </w:num>
-  <w:num w:numId="5" w16cid:durableId="4983992">
+  <w:num w:numId="5" w16cid:durableId="770473207">
     <w:abstractNumId w:val="7"/>
   </w:num>
-  <w:num w:numId="6" w16cid:durableId="1375231135">
+  <w:num w:numId="6" w16cid:durableId="792404149">
     <w:abstractNumId w:val="3"/>
   </w:num>
-  <w:num w:numId="7" w16cid:durableId="14767645">
+  <w:num w:numId="7" w16cid:durableId="1758092245">
     <w:abstractNumId w:val="2"/>
   </w:num>
-  <w:num w:numId="8" w16cid:durableId="1149638298">
+  <w:num w:numId="8" w16cid:durableId="957370577">
     <w:abstractNumId w:val="1"/>
   </w:num>
-  <w:num w:numId="9" w16cid:durableId="1976787517">
+  <w:num w:numId="9" w16cid:durableId="1883980114">
     <w:abstractNumId w:val="0"/>
   </w:num>
 </w:numbering>

</xml_diff>